<commit_message>
added devlog and updated GDD
</commit_message>
<xml_diff>
--- a/Documentation/3000 GDD.docx
+++ b/Documentation/3000 GDD.docx
@@ -4499,15 +4499,7 @@
         <w:t xml:space="preserve">There are a variety of video games I really enjoy but you must play online against other people. This can be frustrating as </w:t>
       </w:r>
       <w:r>
-        <w:t xml:space="preserve">it makes entry to these games quite difficult so as a bit resident evil </w:t>
-      </w:r>
-      <w:proofErr w:type="gramStart"/>
-      <w:r>
-        <w:t>fan</w:t>
-      </w:r>
-      <w:proofErr w:type="gramEnd"/>
-      <w:r>
-        <w:t xml:space="preserve"> I thought a single player mode surviving waves of zombies and other monstrosities would add a good starting point for new players.</w:t>
+        <w:t>it makes entry to these games quite difficult so as a bit resident evil fan I thought a single player mode surviving waves of zombies and other monstrosities would add a good starting point for new players.</w:t>
       </w:r>
       <w:r>
         <w:t xml:space="preserve"> Allows for learning mechanics as well as creating a unique experience for experienced players.</w:t>
@@ -4541,13 +4533,8 @@
         <w:t>retreat,</w:t>
       </w:r>
       <w:r>
-        <w:t xml:space="preserve"> and the horde grows ever closer to the </w:t>
-      </w:r>
-      <w:proofErr w:type="gramStart"/>
-      <w:r>
-        <w:t>safe haven</w:t>
-      </w:r>
-      <w:proofErr w:type="gramEnd"/>
+        <w:t xml:space="preserve"> and the horde grows ever closer to the safe haven</w:t>
+      </w:r>
       <w:r>
         <w:t xml:space="preserve">. Patients will be key as the player will have to balance expansion and survival. It will be a steep learning curve </w:t>
       </w:r>
@@ -4740,15 +4727,7 @@
         <w:t>ment</w:t>
       </w:r>
       <w:r>
-        <w:t xml:space="preserve"> of resources will be. This also links into </w:t>
-      </w:r>
-      <w:proofErr w:type="gramStart"/>
-      <w:r>
-        <w:t>future plans</w:t>
-      </w:r>
-      <w:proofErr w:type="gramEnd"/>
-      <w:r>
-        <w:t xml:space="preserve"> to convert the game into a multiplayer experience</w:t>
+        <w:t xml:space="preserve"> of resources will be. This also links into future plans to convert the game into a multiplayer experience</w:t>
       </w:r>
       <w:r>
         <w:t>.</w:t>
@@ -4812,15 +4791,7 @@
         <w:t>Alternatively,</w:t>
       </w:r>
       <w:r>
-        <w:t xml:space="preserve"> a hospital may give you an instant </w:t>
-      </w:r>
-      <w:proofErr w:type="gramStart"/>
-      <w:r>
-        <w:t>one time</w:t>
-      </w:r>
-      <w:proofErr w:type="gramEnd"/>
-      <w:r>
-        <w:t xml:space="preserve"> increase of medical supplies.</w:t>
+        <w:t xml:space="preserve"> a hospital may give you an instant one time increase of medical supplies.</w:t>
       </w:r>
     </w:p>
     <w:p>
@@ -4891,15 +4862,7 @@
     <w:p>
       <w:r>
         <w:lastRenderedPageBreak/>
-        <w:t xml:space="preserve">There is also a huge military strategic theme throughout the game. This is a common theme in RTS games such as Company of </w:t>
-      </w:r>
-      <w:proofErr w:type="gramStart"/>
-      <w:r>
-        <w:t>Heroes</w:t>
-      </w:r>
-      <w:proofErr w:type="gramEnd"/>
-      <w:r>
-        <w:t xml:space="preserve"> but this is added to with Depot Deltas USP of </w:t>
+        <w:t xml:space="preserve">There is also a huge military strategic theme throughout the game. This is a common theme in RTS games such as Company of Heroes but this is added to with Depot Deltas USP of </w:t>
       </w:r>
       <w:r>
         <w:t xml:space="preserve">adding in the logistical </w:t>
@@ -5008,15 +4971,7 @@
         <w:t xml:space="preserve">closest zombies to them every time they reload. </w:t>
       </w:r>
       <w:r>
-        <w:t xml:space="preserve">Different units will have different ranges they can fire. Some units will also have melee </w:t>
-      </w:r>
-      <w:proofErr w:type="gramStart"/>
-      <w:r>
-        <w:t>capability</w:t>
-      </w:r>
-      <w:proofErr w:type="gramEnd"/>
-      <w:r>
-        <w:t xml:space="preserve"> but this is risky due to meaning the zombies will have to get close to them to attack.</w:t>
+        <w:t>Different units will have different ranges they can fire. Some units will also have melee capability but this is risky due to meaning the zombies will have to get close to them to attack.</w:t>
       </w:r>
       <w:r>
         <w:t xml:space="preserve"> Combat uses resources so the player must ensure units remain stocked to be able to combat the oncoming hordes.</w:t>
@@ -5122,6 +5077,9 @@
     </w:p>
     <w:p>
       <w:r>
+        <w:rPr>
+          <w:noProof/>
+        </w:rPr>
         <w:drawing>
           <wp:inline distT="0" distB="0" distL="0" distR="0" wp14:anchorId="49D46620" wp14:editId="7160C4D4">
             <wp:extent cx="2149152" cy="2286000"/>
@@ -5204,6 +5162,9 @@
     </w:p>
     <w:p>
       <w:r>
+        <w:rPr>
+          <w:noProof/>
+        </w:rPr>
         <w:drawing>
           <wp:inline distT="0" distB="0" distL="0" distR="0" wp14:anchorId="289498EA" wp14:editId="5A23FBB7">
             <wp:extent cx="2047875" cy="2159136"/>
@@ -5297,6 +5258,7 @@
         <w:rPr>
           <w:b/>
           <w:bCs/>
+          <w:noProof/>
           <w:u w:val="single"/>
         </w:rPr>
         <w:drawing>
@@ -5474,15 +5436,7 @@
         <w:t xml:space="preserve"> through bodily fluids. </w:t>
       </w:r>
       <w:r>
-        <w:t xml:space="preserve">Global superpowers united their forces creating depots for the living spread throughout the world creating </w:t>
-      </w:r>
-      <w:proofErr w:type="gramStart"/>
-      <w:r>
-        <w:t>a safe haven</w:t>
-      </w:r>
-      <w:proofErr w:type="gramEnd"/>
-      <w:r>
-        <w:t xml:space="preserve"> for the living that could make it there</w:t>
+        <w:t>Global superpowers united their forces creating depots for the living spread throughout the world creating a safe haven for the living that could make it there</w:t>
       </w:r>
     </w:p>
     <w:p>
@@ -5613,15 +5567,7 @@
         <w:t>with the survivors of delta if they can make it to the shoreline</w:t>
       </w:r>
       <w:r>
-        <w:t xml:space="preserve"> giving them a new </w:t>
-      </w:r>
-      <w:proofErr w:type="gramStart"/>
-      <w:r>
-        <w:t>safe haven</w:t>
-      </w:r>
-      <w:proofErr w:type="gramEnd"/>
-      <w:r>
-        <w:t xml:space="preserve"> and a chance to save the world</w:t>
+        <w:t xml:space="preserve"> giving them a new safe haven and a chance to save the world</w:t>
       </w:r>
       <w:r>
         <w:t>.</w:t>
@@ -5839,6 +5785,7 @@
         <w:rPr>
           <w:b/>
           <w:bCs/>
+          <w:noProof/>
         </w:rPr>
         <w:drawing>
           <wp:inline distT="0" distB="0" distL="0" distR="0" wp14:anchorId="3939B77D" wp14:editId="326A9A01">
@@ -5946,6 +5893,7 @@
         <w:rPr>
           <w:b/>
           <w:bCs/>
+          <w:noProof/>
         </w:rPr>
         <w:drawing>
           <wp:inline distT="0" distB="0" distL="0" distR="0" wp14:anchorId="49ECB3BF" wp14:editId="28B29DB9">
@@ -6046,6 +5994,7 @@
         <w:rPr>
           <w:b/>
           <w:bCs/>
+          <w:noProof/>
         </w:rPr>
         <w:drawing>
           <wp:inline distT="0" distB="0" distL="0" distR="0" wp14:anchorId="0D1ADAAA" wp14:editId="21D86E72">
@@ -6144,6 +6093,7 @@
       <w:r>
         <w:rPr>
           <w:b/>
+          <w:noProof/>
         </w:rPr>
         <w:drawing>
           <wp:inline distT="0" distB="0" distL="0" distR="0" wp14:anchorId="1C517C6F" wp14:editId="496933F7">
@@ -7139,23 +7089,7 @@
           <w:b/>
           <w:bCs/>
         </w:rPr>
-        <w:t xml:space="preserve">Must </w:t>
-      </w:r>
-      <w:proofErr w:type="gramStart"/>
-      <w:r>
-        <w:rPr>
-          <w:b/>
-          <w:bCs/>
-        </w:rPr>
-        <w:t>Have :</w:t>
-      </w:r>
-      <w:proofErr w:type="gramEnd"/>
-      <w:r>
-        <w:rPr>
-          <w:b/>
-          <w:bCs/>
-        </w:rPr>
-        <w:t xml:space="preserve"> This item needs to be present to hit market </w:t>
+        <w:t>Must Have : This item needs to be present to hit market </w:t>
       </w:r>
     </w:p>
     <w:p>
@@ -7174,23 +7108,7 @@
           <w:b/>
           <w:bCs/>
         </w:rPr>
-        <w:t xml:space="preserve">Should </w:t>
-      </w:r>
-      <w:proofErr w:type="gramStart"/>
-      <w:r>
-        <w:rPr>
-          <w:b/>
-          <w:bCs/>
-        </w:rPr>
-        <w:t>Have :</w:t>
-      </w:r>
-      <w:proofErr w:type="gramEnd"/>
-      <w:r>
-        <w:rPr>
-          <w:b/>
-          <w:bCs/>
-        </w:rPr>
-        <w:t xml:space="preserve"> This item ensures product is the expected quality amongst its peers </w:t>
+        <w:t>Should Have : This item ensures product is the expected quality amongst its peers </w:t>
       </w:r>
     </w:p>
     <w:p>
@@ -7421,13 +7339,8 @@
         <w:t>The food, water etc a unit requires a day</w:t>
       </w:r>
       <w:r>
-        <w:t xml:space="preserve"> consumed at a fixed rate every x </w:t>
-      </w:r>
-      <w:proofErr w:type="gramStart"/>
-      <w:r>
-        <w:t>hours</w:t>
-      </w:r>
-      <w:proofErr w:type="gramEnd"/>
+        <w:t xml:space="preserve"> consumed at a fixed rate every x hours</w:t>
+      </w:r>
     </w:p>
     <w:p>
       <w:pPr>
@@ -7562,15 +7475,7 @@
         </w:numPr>
       </w:pPr>
       <w:r>
-        <w:t xml:space="preserve">There will be a minimap to show the location of all the </w:t>
-      </w:r>
-      <w:proofErr w:type="gramStart"/>
-      <w:r>
-        <w:t>users</w:t>
-      </w:r>
-      <w:proofErr w:type="gramEnd"/>
-      <w:r>
-        <w:t xml:space="preserve"> units</w:t>
+        <w:t>There will be a minimap to show the location of all the users units</w:t>
       </w:r>
     </w:p>
     <w:p>
@@ -7904,15 +7809,7 @@
         </w:numPr>
       </w:pPr>
       <w:r>
-        <w:t xml:space="preserve">Can only have a set </w:t>
-      </w:r>
-      <w:proofErr w:type="gramStart"/>
-      <w:r>
-        <w:t>amount</w:t>
-      </w:r>
-      <w:proofErr w:type="gramEnd"/>
-      <w:r>
-        <w:t xml:space="preserve"> of convoys outside the depot at a time so must be returned to the depot</w:t>
+        <w:t>Can only have a set amount of convoys outside the depot at a time so must be returned to the depot</w:t>
       </w:r>
     </w:p>
     <w:p>
@@ -8154,15 +8051,7 @@
         </w:numPr>
       </w:pPr>
       <w:r>
-        <w:t xml:space="preserve">Visual indicators for what </w:t>
-      </w:r>
-      <w:proofErr w:type="gramStart"/>
-      <w:r>
-        <w:t>is</w:t>
-      </w:r>
-      <w:proofErr w:type="gramEnd"/>
-      <w:r>
-        <w:t xml:space="preserve"> attacking what e.g. red line joining a unit and what it is firing at</w:t>
+        <w:t>Visual indicators for what is attacking what e.g. red line joining a unit and what it is firing at</w:t>
       </w:r>
       <w:r>
         <w:t xml:space="preserve">. </w:t>
@@ -8253,267 +8142,7 @@
       </w:r>
     </w:p>
     <w:p>
-      <w:pPr>
-        <w:pStyle w:val="Heading2"/>
-      </w:pPr>
-      <w:bookmarkStart w:id="44" w:name="_Toc209875210"/>
-      <w:r>
-        <w:t>Stretch Goals</w:t>
-      </w:r>
-      <w:bookmarkEnd w:id="44"/>
-      <w:r>
-        <w:t> </w:t>
-      </w:r>
-    </w:p>
-    <w:p>
-      <w:pPr>
-        <w:pStyle w:val="Heading2"/>
-      </w:pPr>
-      <w:bookmarkStart w:id="45" w:name="_Toc209875211"/>
-      <w:r>
-        <w:t>Delivery</w:t>
-      </w:r>
-      <w:bookmarkEnd w:id="45"/>
-      <w:r>
-        <w:t> </w:t>
-      </w:r>
-    </w:p>
-    <w:p>
-      <w:pPr>
-        <w:pStyle w:val="Heading2"/>
-      </w:pPr>
-      <w:bookmarkStart w:id="46" w:name="_Toc209875212"/>
-      <w:r>
-        <w:t>Marketing</w:t>
-      </w:r>
-      <w:bookmarkEnd w:id="46"/>
-      <w:r>
-        <w:t> </w:t>
-      </w:r>
-    </w:p>
-    <w:p>
-      <w:pPr>
-        <w:pStyle w:val="Heading2"/>
-      </w:pPr>
-      <w:bookmarkStart w:id="47" w:name="_Toc209875213"/>
-      <w:r>
-        <w:t>Post-Launch</w:t>
-      </w:r>
-      <w:bookmarkEnd w:id="47"/>
-      <w:r>
-        <w:t> </w:t>
-      </w:r>
-    </w:p>
-    <w:p>
-      <w:r>
-        <w:t> </w:t>
-      </w:r>
-    </w:p>
-    <w:p>
-      <w:pPr>
-        <w:numPr>
-          <w:ilvl w:val="0"/>
-          <w:numId w:val="51"/>
-        </w:numPr>
-        <w:rPr>
-          <w:b/>
-          <w:bCs/>
-        </w:rPr>
-      </w:pPr>
-      <w:r>
-        <w:rPr>
-          <w:b/>
-          <w:bCs/>
-        </w:rPr>
-        <w:t>Things to consider after launch </w:t>
-      </w:r>
-    </w:p>
-    <w:p>
-      <w:pPr>
-        <w:numPr>
-          <w:ilvl w:val="0"/>
-          <w:numId w:val="52"/>
-        </w:numPr>
-        <w:rPr>
-          <w:b/>
-          <w:bCs/>
-        </w:rPr>
-      </w:pPr>
-      <w:r>
-        <w:rPr>
-          <w:b/>
-          <w:bCs/>
-        </w:rPr>
-        <w:t>Feedback </w:t>
-      </w:r>
-    </w:p>
-    <w:p>
-      <w:pPr>
-        <w:numPr>
-          <w:ilvl w:val="0"/>
-          <w:numId w:val="53"/>
-        </w:numPr>
-        <w:rPr>
-          <w:b/>
-          <w:bCs/>
-        </w:rPr>
-      </w:pPr>
-      <w:r>
-        <w:rPr>
-          <w:b/>
-          <w:bCs/>
-        </w:rPr>
-        <w:t>Bug Fixing </w:t>
-      </w:r>
-    </w:p>
-    <w:p>
-      <w:r>
-        <w:t> </w:t>
-      </w:r>
-    </w:p>
-    <w:p>
-      <w:pPr>
-        <w:pStyle w:val="Heading1"/>
-      </w:pPr>
-      <w:bookmarkStart w:id="48" w:name="_Toc209875214"/>
-      <w:r>
-        <w:t>Technical Requirements</w:t>
-      </w:r>
-      <w:bookmarkEnd w:id="48"/>
-      <w:r>
-        <w:t> </w:t>
-      </w:r>
-    </w:p>
-    <w:p>
-      <w:r>
-        <w:t> </w:t>
-      </w:r>
-    </w:p>
-    <w:p>
-      <w:pPr>
-        <w:pStyle w:val="Heading2"/>
-      </w:pPr>
-      <w:bookmarkStart w:id="49" w:name="_Toc209875215"/>
-      <w:r>
-        <w:t>Known Issues</w:t>
-      </w:r>
-      <w:bookmarkEnd w:id="49"/>
-      <w:r>
-        <w:t> </w:t>
-      </w:r>
-    </w:p>
-    <w:p>
-      <w:r>
-        <w:t> </w:t>
-      </w:r>
-    </w:p>
-    <w:p>
-      <w:pPr>
-        <w:numPr>
-          <w:ilvl w:val="0"/>
-          <w:numId w:val="54"/>
-        </w:numPr>
-        <w:rPr>
-          <w:b/>
-          <w:bCs/>
-        </w:rPr>
-      </w:pPr>
-      <w:r>
-        <w:rPr>
-          <w:b/>
-          <w:bCs/>
-        </w:rPr>
-        <w:t>Existing problems, bugs, limitations, challenges </w:t>
-      </w:r>
-    </w:p>
-    <w:p>
-      <w:r>
-        <w:t> </w:t>
-      </w:r>
-    </w:p>
-    <w:p>
-      <w:pPr>
-        <w:pStyle w:val="Heading2"/>
-      </w:pPr>
-      <w:bookmarkStart w:id="50" w:name="_Toc209875216"/>
-      <w:r>
-        <w:t>Systems</w:t>
-      </w:r>
-      <w:bookmarkEnd w:id="50"/>
-      <w:r>
-        <w:t> </w:t>
-      </w:r>
-    </w:p>
-    <w:p>
-      <w:r>
-        <w:t> </w:t>
-      </w:r>
-    </w:p>
-    <w:p>
-      <w:pPr>
-        <w:numPr>
-          <w:ilvl w:val="0"/>
-          <w:numId w:val="55"/>
-        </w:numPr>
-        <w:rPr>
-          <w:b/>
-          <w:bCs/>
-        </w:rPr>
-      </w:pPr>
-      <w:r>
-        <w:rPr>
-          <w:b/>
-          <w:bCs/>
-        </w:rPr>
-        <w:t>Complex macro elements that need to be built and which require further depth and planning of their own </w:t>
-      </w:r>
-    </w:p>
-    <w:p>
-      <w:pPr>
-        <w:numPr>
-          <w:ilvl w:val="0"/>
-          <w:numId w:val="56"/>
-        </w:numPr>
-        <w:rPr>
-          <w:b/>
-          <w:bCs/>
-        </w:rPr>
-      </w:pPr>
-      <w:r>
-        <w:rPr>
-          <w:b/>
-          <w:bCs/>
-        </w:rPr>
-        <w:t>Discrete modules that can be built in isolation and swapped in or out like components </w:t>
-      </w:r>
-    </w:p>
-    <w:p>
-      <w:pPr>
-        <w:numPr>
-          <w:ilvl w:val="0"/>
-          <w:numId w:val="57"/>
-        </w:numPr>
-        <w:rPr>
-          <w:b/>
-          <w:bCs/>
-        </w:rPr>
-      </w:pPr>
-      <w:r>
-        <w:rPr>
-          <w:b/>
-          <w:bCs/>
-        </w:rPr>
-        <w:t>Weather, day-night, schedules, inventory, health, pathfinding, character creation, etc. </w:t>
-      </w:r>
-    </w:p>
-    <w:p>
-      <w:r>
-        <w:t> </w:t>
-      </w:r>
-    </w:p>
-    <w:p>
-      <w:r>
-        <w:lastRenderedPageBreak/>
+      <w:r>
         <w:t> </w:t>
       </w:r>
     </w:p>

</xml_diff>